<commit_message>
Josefa Palacio: hoja de vida 2026 y declaración llenada sin firma
Co-Authored-By: Claude Opus 5.5 <noreply@anthropic.com>
Claude-Session: https://claude.ai/code/session_012B5UyXLL9ubxzuQGBWyzbg
</commit_message>
<xml_diff>
--- a/curso-obesidad-seda/expediente/hojas-de-vida/CV_Palacio-Riofrio_Josefa.docx
+++ b/curso-obesidad-seda/expediente/hojas-de-vida/CV_Palacio-Riofrio_Josefa.docx
@@ -1,6 +1,6 @@
 
 <file path=word/document.xml><?xml version="1.0" encoding="utf-8"?>
-<w:document xmlns:wpc="http://schemas.microsoft.com/office/word/2010/wordprocessingCanvas" xmlns:cx="http://schemas.microsoft.com/office/drawing/2014/chartex" xmlns:mc="http://schemas.openxmlformats.org/markup-compatibility/2006" xmlns:o="urn:schemas-microsoft-com:office:office" xmlns:r="http://schemas.openxmlformats.org/officeDocument/2006/relationships" xmlns:m="http://schemas.openxmlformats.org/officeDocument/2006/math" xmlns:v="urn:schemas-microsoft-com:vml" xmlns:wp14="http://schemas.microsoft.com/office/word/2010/wordprocessingDrawing" xmlns:wp="http://schemas.openxmlformats.org/drawingml/2006/wordprocessingDrawing" xmlns:w10="urn:schemas-microsoft-com:office:word" xmlns:w="http://schemas.openxmlformats.org/wordprocessingml/2006/main" xmlns:w14="http://schemas.microsoft.com/office/word/2010/wordml" xmlns:w15="http://schemas.microsoft.com/office/word/2012/wordml" xmlns:w16se="http://schemas.microsoft.com/office/word/2015/wordml/symex" xmlns:wpg="http://schemas.microsoft.com/office/word/2010/wordprocessingGroup" xmlns:wpi="http://schemas.microsoft.com/office/word/2010/wordprocessingInk" xmlns:wne="http://schemas.microsoft.com/office/word/2006/wordml" xmlns:wps="http://schemas.microsoft.com/office/word/2010/wordprocessingShape" mc:Ignorable="w14 w15 w16se wp14">
+<w:document xmlns:wpc="http://schemas.microsoft.com/office/word/2010/wordprocessingCanvas" xmlns:cx="http://schemas.microsoft.com/office/drawing/2014/chartex" xmlns:cx1="http://schemas.microsoft.com/office/drawing/2015/9/8/chartex" xmlns:cx2="http://schemas.microsoft.com/office/drawing/2015/10/21/chartex" xmlns:cx3="http://schemas.microsoft.com/office/drawing/2016/5/9/chartex" xmlns:cx4="http://schemas.microsoft.com/office/drawing/2016/5/10/chartex" xmlns:cx5="http://schemas.microsoft.com/office/drawing/2016/5/11/chartex" xmlns:cx6="http://schemas.microsoft.com/office/drawing/2016/5/12/chartex" xmlns:cx7="http://schemas.microsoft.com/office/drawing/2016/5/13/chartex" xmlns:cx8="http://schemas.microsoft.com/office/drawing/2016/5/14/chartex" xmlns:mc="http://schemas.openxmlformats.org/markup-compatibility/2006" xmlns:m="http://schemas.openxmlformats.org/officeDocument/2006/math" xmlns:aink="http://schemas.microsoft.com/office/drawing/2016/ink" xmlns:am3d="http://schemas.microsoft.com/office/drawing/2017/model3d" xmlns:oel="http://schemas.microsoft.com/office/2019/extlst" xmlns:r="http://schemas.openxmlformats.org/officeDocument/2006/relationships" xmlns:wp14="http://schemas.microsoft.com/office/word/2010/wordprocessingDrawing" xmlns:wp="http://schemas.openxmlformats.org/drawingml/2006/wordprocessingDrawing" xmlns:wpg="http://schemas.microsoft.com/office/word/2010/wordprocessingGroup" xmlns:wpi="http://schemas.microsoft.com/office/word/2010/wordprocessingInk" xmlns:wps="http://schemas.microsoft.com/office/word/2010/wordprocessingShape" xmlns:o="urn:schemas-microsoft-com:office:office" xmlns:v="urn:schemas-microsoft-com:vml" xmlns:w10="urn:schemas-microsoft-com:office:word" xmlns:w="http://schemas.openxmlformats.org/wordprocessingml/2006/main" xmlns:w14="http://schemas.microsoft.com/office/word/2010/wordml" xmlns:w15="http://schemas.microsoft.com/office/word/2012/wordml" xmlns:w16cex="http://schemas.microsoft.com/office/word/2018/wordml/cex" xmlns:w16cid="http://schemas.microsoft.com/office/word/2016/wordml/cid" xmlns:w16="http://schemas.microsoft.com/office/word/2018/wordml" xmlns:w16sdtdh="http://schemas.microsoft.com/office/word/2020/wordml/sdtdatahash" xmlns:w16sdtfl="http://schemas.microsoft.com/office/word/2024/wordml/sdtformatlock" xmlns:w16se="http://schemas.microsoft.com/office/word/2015/wordml/symex" xmlns:w16du="http://schemas.microsoft.com/office/word/2023/wordml/word16du" xmlns:wne="http://schemas.microsoft.com/office/word/2006/wordml" mc:Ignorable="w14 w15 w16se w16cid w16 w16cex w16sdtdh w16sdtfl w16du wp14">
   <w:body>
     <w:p>
       <w:pPr>
@@ -14,14 +14,11 @@
           <w:szCs w:val="24"/>
         </w:rPr>
       </w:pPr>
-      <w:bookmarkStart w:id="0" w:name="_GoBack"/>
-      <w:bookmarkEnd w:id="0"/>
       <w:r>
         <w:rPr>
           <w:noProof/>
           <w:sz w:val="24"/>
           <w:szCs w:val="24"/>
-          <w:lang w:val="es-EC" w:eastAsia="es-EC"/>
         </w:rPr>
         <w:drawing>
           <wp:anchor distT="0" distB="0" distL="114300" distR="114300" simplePos="0" relativeHeight="251659264" behindDoc="0" locked="0" layoutInCell="1" allowOverlap="1" wp14:anchorId="69191D3F" wp14:editId="146BF898">
@@ -228,14 +225,87 @@
           <w:rFonts w:eastAsia="Times New Roman"/>
         </w:rPr>
       </w:pPr>
-      <w:r>
-        <w:rPr>
-          <w:rFonts w:hAnsi="Calibri"/>
-          <w:color w:val="000000" w:themeColor="text1"/>
-          <w:kern w:val="24"/>
-          <w:lang w:val="fr-FR"/>
-        </w:rPr>
-        <w:t>Medicina General: Universidad  Nacional de Loja</w:t>
+      <w:proofErr w:type="spellStart"/>
+      <w:r>
+        <w:rPr>
+          <w:rFonts w:hAnsi="Calibri"/>
+          <w:color w:val="000000" w:themeColor="text1"/>
+          <w:kern w:val="24"/>
+          <w:lang w:val="fr-FR"/>
+        </w:rPr>
+        <w:t>Medicina</w:t>
+      </w:r>
+      <w:proofErr w:type="spellEnd"/>
+      <w:r>
+        <w:rPr>
+          <w:rFonts w:hAnsi="Calibri"/>
+          <w:color w:val="000000" w:themeColor="text1"/>
+          <w:kern w:val="24"/>
+          <w:lang w:val="fr-FR"/>
+        </w:rPr>
+        <w:t xml:space="preserve"> </w:t>
+      </w:r>
+      <w:proofErr w:type="gramStart"/>
+      <w:r>
+        <w:rPr>
+          <w:rFonts w:hAnsi="Calibri"/>
+          <w:color w:val="000000" w:themeColor="text1"/>
+          <w:kern w:val="24"/>
+          <w:lang w:val="fr-FR"/>
+        </w:rPr>
+        <w:t>General:</w:t>
+      </w:r>
+      <w:proofErr w:type="gramEnd"/>
+      <w:r>
+        <w:rPr>
+          <w:rFonts w:hAnsi="Calibri"/>
+          <w:color w:val="000000" w:themeColor="text1"/>
+          <w:kern w:val="24"/>
+          <w:lang w:val="fr-FR"/>
+        </w:rPr>
+        <w:t xml:space="preserve"> </w:t>
+      </w:r>
+      <w:proofErr w:type="spellStart"/>
+      <w:proofErr w:type="gramStart"/>
+      <w:r>
+        <w:rPr>
+          <w:rFonts w:hAnsi="Calibri"/>
+          <w:color w:val="000000" w:themeColor="text1"/>
+          <w:kern w:val="24"/>
+          <w:lang w:val="fr-FR"/>
+        </w:rPr>
+        <w:t>Universidad</w:t>
+      </w:r>
+      <w:proofErr w:type="spellEnd"/>
+      <w:r>
+        <w:rPr>
+          <w:rFonts w:hAnsi="Calibri"/>
+          <w:color w:val="000000" w:themeColor="text1"/>
+          <w:kern w:val="24"/>
+          <w:lang w:val="fr-FR"/>
+        </w:rPr>
+        <w:t xml:space="preserve">  </w:t>
+      </w:r>
+      <w:proofErr w:type="spellStart"/>
+      <w:r>
+        <w:rPr>
+          <w:rFonts w:hAnsi="Calibri"/>
+          <w:color w:val="000000" w:themeColor="text1"/>
+          <w:kern w:val="24"/>
+          <w:lang w:val="fr-FR"/>
+        </w:rPr>
+        <w:t>Nacional</w:t>
+      </w:r>
+      <w:proofErr w:type="spellEnd"/>
+      <w:proofErr w:type="gramEnd"/>
+      <w:r>
+        <w:rPr>
+          <w:rFonts w:hAnsi="Calibri"/>
+          <w:color w:val="000000" w:themeColor="text1"/>
+          <w:kern w:val="24"/>
+          <w:lang w:val="fr-FR"/>
+        </w:rPr>
+        <w:t xml:space="preserve"> de Loja</w:t>
       </w:r>
     </w:p>
     <w:p>
@@ -250,14 +320,107 @@
           <w:rFonts w:eastAsia="Times New Roman"/>
         </w:rPr>
       </w:pPr>
-      <w:r>
-        <w:rPr>
-          <w:rFonts w:hAnsi="Calibri"/>
-          <w:color w:val="000000" w:themeColor="text1"/>
-          <w:kern w:val="24"/>
-          <w:lang w:val="fr-FR"/>
-        </w:rPr>
-        <w:t>Diplomado en Gerencia de Salud: Universidad  Nacional de Loja</w:t>
+      <w:proofErr w:type="spellStart"/>
+      <w:r>
+        <w:rPr>
+          <w:rFonts w:hAnsi="Calibri"/>
+          <w:color w:val="000000" w:themeColor="text1"/>
+          <w:kern w:val="24"/>
+          <w:lang w:val="fr-FR"/>
+        </w:rPr>
+        <w:t>Diplomado</w:t>
+      </w:r>
+      <w:proofErr w:type="spellEnd"/>
+      <w:r>
+        <w:rPr>
+          <w:rFonts w:hAnsi="Calibri"/>
+          <w:color w:val="000000" w:themeColor="text1"/>
+          <w:kern w:val="24"/>
+          <w:lang w:val="fr-FR"/>
+        </w:rPr>
+        <w:t xml:space="preserve"> en </w:t>
+      </w:r>
+      <w:proofErr w:type="spellStart"/>
+      <w:r>
+        <w:rPr>
+          <w:rFonts w:hAnsi="Calibri"/>
+          <w:color w:val="000000" w:themeColor="text1"/>
+          <w:kern w:val="24"/>
+          <w:lang w:val="fr-FR"/>
+        </w:rPr>
+        <w:t>Gerencia</w:t>
+      </w:r>
+      <w:proofErr w:type="spellEnd"/>
+      <w:r>
+        <w:rPr>
+          <w:rFonts w:hAnsi="Calibri"/>
+          <w:color w:val="000000" w:themeColor="text1"/>
+          <w:kern w:val="24"/>
+          <w:lang w:val="fr-FR"/>
+        </w:rPr>
+        <w:t xml:space="preserve"> de </w:t>
+      </w:r>
+      <w:proofErr w:type="gramStart"/>
+      <w:r>
+        <w:rPr>
+          <w:rFonts w:hAnsi="Calibri"/>
+          <w:color w:val="000000" w:themeColor="text1"/>
+          <w:kern w:val="24"/>
+          <w:lang w:val="fr-FR"/>
+        </w:rPr>
+        <w:t>Salud:</w:t>
+      </w:r>
+      <w:proofErr w:type="gramEnd"/>
+      <w:r>
+        <w:rPr>
+          <w:rFonts w:hAnsi="Calibri"/>
+          <w:color w:val="000000" w:themeColor="text1"/>
+          <w:kern w:val="24"/>
+          <w:lang w:val="fr-FR"/>
+        </w:rPr>
+        <w:t xml:space="preserve"> </w:t>
+      </w:r>
+      <w:proofErr w:type="spellStart"/>
+      <w:proofErr w:type="gramStart"/>
+      <w:r>
+        <w:rPr>
+          <w:rFonts w:hAnsi="Calibri"/>
+          <w:color w:val="000000" w:themeColor="text1"/>
+          <w:kern w:val="24"/>
+          <w:lang w:val="fr-FR"/>
+        </w:rPr>
+        <w:t>Universidad</w:t>
+      </w:r>
+      <w:proofErr w:type="spellEnd"/>
+      <w:r>
+        <w:rPr>
+          <w:rFonts w:hAnsi="Calibri"/>
+          <w:color w:val="000000" w:themeColor="text1"/>
+          <w:kern w:val="24"/>
+          <w:lang w:val="fr-FR"/>
+        </w:rPr>
+        <w:t xml:space="preserve">  </w:t>
+      </w:r>
+      <w:proofErr w:type="spellStart"/>
+      <w:r>
+        <w:rPr>
+          <w:rFonts w:hAnsi="Calibri"/>
+          <w:color w:val="000000" w:themeColor="text1"/>
+          <w:kern w:val="24"/>
+          <w:lang w:val="fr-FR"/>
+        </w:rPr>
+        <w:t>Nacional</w:t>
+      </w:r>
+      <w:proofErr w:type="spellEnd"/>
+      <w:proofErr w:type="gramEnd"/>
+      <w:r>
+        <w:rPr>
+          <w:rFonts w:hAnsi="Calibri"/>
+          <w:color w:val="000000" w:themeColor="text1"/>
+          <w:kern w:val="24"/>
+          <w:lang w:val="fr-FR"/>
+        </w:rPr>
+        <w:t xml:space="preserve"> de Loja</w:t>
       </w:r>
     </w:p>
     <w:p>
@@ -272,14 +435,76 @@
           <w:rFonts w:eastAsia="Times New Roman"/>
         </w:rPr>
       </w:pPr>
-      <w:r>
-        <w:rPr>
-          <w:rFonts w:hAnsi="Calibri"/>
-          <w:color w:val="000000" w:themeColor="text1"/>
-          <w:kern w:val="24"/>
-          <w:lang w:val="fr-FR"/>
-        </w:rPr>
-        <w:t>Medicina Interna: Universidad  Cat</w:t>
+      <w:proofErr w:type="spellStart"/>
+      <w:r>
+        <w:rPr>
+          <w:rFonts w:hAnsi="Calibri"/>
+          <w:color w:val="000000" w:themeColor="text1"/>
+          <w:kern w:val="24"/>
+          <w:lang w:val="fr-FR"/>
+        </w:rPr>
+        <w:t>Medicina</w:t>
+      </w:r>
+      <w:proofErr w:type="spellEnd"/>
+      <w:r>
+        <w:rPr>
+          <w:rFonts w:hAnsi="Calibri"/>
+          <w:color w:val="000000" w:themeColor="text1"/>
+          <w:kern w:val="24"/>
+          <w:lang w:val="fr-FR"/>
+        </w:rPr>
+        <w:t xml:space="preserve"> </w:t>
+      </w:r>
+      <w:proofErr w:type="gramStart"/>
+      <w:r>
+        <w:rPr>
+          <w:rFonts w:hAnsi="Calibri"/>
+          <w:color w:val="000000" w:themeColor="text1"/>
+          <w:kern w:val="24"/>
+          <w:lang w:val="fr-FR"/>
+        </w:rPr>
+        <w:t>Interna:</w:t>
+      </w:r>
+      <w:proofErr w:type="gramEnd"/>
+      <w:r>
+        <w:rPr>
+          <w:rFonts w:hAnsi="Calibri"/>
+          <w:color w:val="000000" w:themeColor="text1"/>
+          <w:kern w:val="24"/>
+          <w:lang w:val="fr-FR"/>
+        </w:rPr>
+        <w:t xml:space="preserve"> </w:t>
+      </w:r>
+      <w:proofErr w:type="spellStart"/>
+      <w:proofErr w:type="gramStart"/>
+      <w:r>
+        <w:rPr>
+          <w:rFonts w:hAnsi="Calibri"/>
+          <w:color w:val="000000" w:themeColor="text1"/>
+          <w:kern w:val="24"/>
+          <w:lang w:val="fr-FR"/>
+        </w:rPr>
+        <w:t>Universidad</w:t>
+      </w:r>
+      <w:proofErr w:type="spellEnd"/>
+      <w:r>
+        <w:rPr>
+          <w:rFonts w:hAnsi="Calibri"/>
+          <w:color w:val="000000" w:themeColor="text1"/>
+          <w:kern w:val="24"/>
+          <w:lang w:val="fr-FR"/>
+        </w:rPr>
+        <w:t xml:space="preserve">  </w:t>
+      </w:r>
+      <w:proofErr w:type="spellStart"/>
+      <w:r>
+        <w:rPr>
+          <w:rFonts w:hAnsi="Calibri"/>
+          <w:color w:val="000000" w:themeColor="text1"/>
+          <w:kern w:val="24"/>
+          <w:lang w:val="fr-FR"/>
+        </w:rPr>
+        <w:t>Cat</w:t>
       </w:r>
       <w:r>
         <w:rPr>
@@ -297,7 +522,58 @@
           <w:kern w:val="24"/>
           <w:lang w:val="fr-FR"/>
         </w:rPr>
-        <w:t>lica Santiago de Guayaquil con sede en  (Hospital Luis Vernaza)</w:t>
+        <w:t>lica</w:t>
+      </w:r>
+      <w:proofErr w:type="spellEnd"/>
+      <w:proofErr w:type="gramEnd"/>
+      <w:r>
+        <w:rPr>
+          <w:rFonts w:hAnsi="Calibri"/>
+          <w:color w:val="000000" w:themeColor="text1"/>
+          <w:kern w:val="24"/>
+          <w:lang w:val="fr-FR"/>
+        </w:rPr>
+        <w:t xml:space="preserve"> Santiago de Guayaquil con </w:t>
+      </w:r>
+      <w:proofErr w:type="spellStart"/>
+      <w:r>
+        <w:rPr>
+          <w:rFonts w:hAnsi="Calibri"/>
+          <w:color w:val="000000" w:themeColor="text1"/>
+          <w:kern w:val="24"/>
+          <w:lang w:val="fr-FR"/>
+        </w:rPr>
+        <w:t>sede</w:t>
+      </w:r>
+      <w:proofErr w:type="spellEnd"/>
+      <w:r>
+        <w:rPr>
+          <w:rFonts w:hAnsi="Calibri"/>
+          <w:color w:val="000000" w:themeColor="text1"/>
+          <w:kern w:val="24"/>
+          <w:lang w:val="fr-FR"/>
+        </w:rPr>
+        <w:t xml:space="preserve"> </w:t>
+      </w:r>
+      <w:proofErr w:type="gramStart"/>
+      <w:r>
+        <w:rPr>
+          <w:rFonts w:hAnsi="Calibri"/>
+          <w:color w:val="000000" w:themeColor="text1"/>
+          <w:kern w:val="24"/>
+          <w:lang w:val="fr-FR"/>
+        </w:rPr>
+        <w:t>en  (</w:t>
+      </w:r>
+      <w:proofErr w:type="gramEnd"/>
+      <w:r>
+        <w:rPr>
+          <w:rFonts w:hAnsi="Calibri"/>
+          <w:color w:val="000000" w:themeColor="text1"/>
+          <w:kern w:val="24"/>
+          <w:lang w:val="fr-FR"/>
+        </w:rPr>
+        <w:t>Hospital Luis Vernaza)</w:t>
       </w:r>
     </w:p>
     <w:p>
@@ -312,6 +588,8 @@
           <w:rFonts w:eastAsia="Times New Roman"/>
         </w:rPr>
       </w:pPr>
+      <w:proofErr w:type="spellStart"/>
+      <w:proofErr w:type="gramStart"/>
       <w:r>
         <w:rPr>
           <w:rFonts w:hAnsi="Calibri"/>
@@ -337,7 +615,77 @@
           <w:kern w:val="24"/>
           <w:lang w:val="fr-FR"/>
         </w:rPr>
-        <w:t>a: Universidad Nacional Aut</w:t>
+        <w:t>a</w:t>
+      </w:r>
+      <w:proofErr w:type="spellEnd"/>
+      <w:r>
+        <w:rPr>
+          <w:rFonts w:hAnsi="Calibri"/>
+          <w:color w:val="000000" w:themeColor="text1"/>
+          <w:kern w:val="24"/>
+          <w:lang w:val="fr-FR"/>
+        </w:rPr>
+        <w:t>:</w:t>
+      </w:r>
+      <w:proofErr w:type="gramEnd"/>
+      <w:r>
+        <w:rPr>
+          <w:rFonts w:hAnsi="Calibri"/>
+          <w:color w:val="000000" w:themeColor="text1"/>
+          <w:kern w:val="24"/>
+          <w:lang w:val="fr-FR"/>
+        </w:rPr>
+        <w:t xml:space="preserve"> </w:t>
+      </w:r>
+      <w:proofErr w:type="spellStart"/>
+      <w:r>
+        <w:rPr>
+          <w:rFonts w:hAnsi="Calibri"/>
+          <w:color w:val="000000" w:themeColor="text1"/>
+          <w:kern w:val="24"/>
+          <w:lang w:val="fr-FR"/>
+        </w:rPr>
+        <w:t>Universidad</w:t>
+      </w:r>
+      <w:proofErr w:type="spellEnd"/>
+      <w:r>
+        <w:rPr>
+          <w:rFonts w:hAnsi="Calibri"/>
+          <w:color w:val="000000" w:themeColor="text1"/>
+          <w:kern w:val="24"/>
+          <w:lang w:val="fr-FR"/>
+        </w:rPr>
+        <w:t xml:space="preserve"> </w:t>
+      </w:r>
+      <w:proofErr w:type="spellStart"/>
+      <w:r>
+        <w:rPr>
+          <w:rFonts w:hAnsi="Calibri"/>
+          <w:color w:val="000000" w:themeColor="text1"/>
+          <w:kern w:val="24"/>
+          <w:lang w:val="fr-FR"/>
+        </w:rPr>
+        <w:t>Nacional</w:t>
+      </w:r>
+      <w:proofErr w:type="spellEnd"/>
+      <w:r>
+        <w:rPr>
+          <w:rFonts w:hAnsi="Calibri"/>
+          <w:color w:val="000000" w:themeColor="text1"/>
+          <w:kern w:val="24"/>
+          <w:lang w:val="fr-FR"/>
+        </w:rPr>
+        <w:t xml:space="preserve"> </w:t>
+      </w:r>
+      <w:proofErr w:type="spellStart"/>
+      <w:r>
+        <w:rPr>
+          <w:rFonts w:hAnsi="Calibri"/>
+          <w:color w:val="000000" w:themeColor="text1"/>
+          <w:kern w:val="24"/>
+          <w:lang w:val="fr-FR"/>
+        </w:rPr>
+        <w:t>Aut</w:t>
       </w:r>
       <w:r>
         <w:rPr>
@@ -355,7 +703,17 @@
           <w:kern w:val="24"/>
           <w:lang w:val="fr-FR"/>
         </w:rPr>
-        <w:t>noma de M</w:t>
+        <w:t>noma</w:t>
+      </w:r>
+      <w:proofErr w:type="spellEnd"/>
+      <w:r>
+        <w:rPr>
+          <w:rFonts w:hAnsi="Calibri"/>
+          <w:color w:val="000000" w:themeColor="text1"/>
+          <w:kern w:val="24"/>
+          <w:lang w:val="fr-FR"/>
+        </w:rPr>
+        <w:t xml:space="preserve"> de M</w:t>
       </w:r>
       <w:r>
         <w:rPr>
@@ -373,7 +731,47 @@
           <w:kern w:val="24"/>
           <w:lang w:val="fr-FR"/>
         </w:rPr>
-        <w:t>xico con sede en  (Hospital General de M</w:t>
+        <w:t xml:space="preserve">xico con </w:t>
+      </w:r>
+      <w:proofErr w:type="spellStart"/>
+      <w:r>
+        <w:rPr>
+          <w:rFonts w:hAnsi="Calibri"/>
+          <w:color w:val="000000" w:themeColor="text1"/>
+          <w:kern w:val="24"/>
+          <w:lang w:val="fr-FR"/>
+        </w:rPr>
+        <w:t>sede</w:t>
+      </w:r>
+      <w:proofErr w:type="spellEnd"/>
+      <w:r>
+        <w:rPr>
+          <w:rFonts w:hAnsi="Calibri"/>
+          <w:color w:val="000000" w:themeColor="text1"/>
+          <w:kern w:val="24"/>
+          <w:lang w:val="fr-FR"/>
+        </w:rPr>
+        <w:t xml:space="preserve"> </w:t>
+      </w:r>
+      <w:proofErr w:type="gramStart"/>
+      <w:r>
+        <w:rPr>
+          <w:rFonts w:hAnsi="Calibri"/>
+          <w:color w:val="000000" w:themeColor="text1"/>
+          <w:kern w:val="24"/>
+          <w:lang w:val="fr-FR"/>
+        </w:rPr>
+        <w:t>en  (</w:t>
+      </w:r>
+      <w:proofErr w:type="gramEnd"/>
+      <w:r>
+        <w:rPr>
+          <w:rFonts w:hAnsi="Calibri"/>
+          <w:color w:val="000000" w:themeColor="text1"/>
+          <w:kern w:val="24"/>
+          <w:lang w:val="fr-FR"/>
+        </w:rPr>
+        <w:t>Hospital General de M</w:t>
       </w:r>
       <w:r>
         <w:rPr>
@@ -406,14 +804,55 @@
           <w:rFonts w:eastAsia="Times New Roman"/>
         </w:rPr>
       </w:pPr>
-      <w:r>
-        <w:rPr>
-          <w:rFonts w:hAnsi="Calibri"/>
-          <w:color w:val="000000" w:themeColor="text1"/>
-          <w:kern w:val="24"/>
-          <w:lang w:val="fr-FR"/>
-        </w:rPr>
-        <w:t>Certificada por el Consejo mexicano de endocrinolog</w:t>
+      <w:proofErr w:type="spellStart"/>
+      <w:r>
+        <w:rPr>
+          <w:rFonts w:hAnsi="Calibri"/>
+          <w:color w:val="000000" w:themeColor="text1"/>
+          <w:kern w:val="24"/>
+          <w:lang w:val="fr-FR"/>
+        </w:rPr>
+        <w:t>Certificada</w:t>
+      </w:r>
+      <w:proofErr w:type="spellEnd"/>
+      <w:r>
+        <w:rPr>
+          <w:rFonts w:hAnsi="Calibri"/>
+          <w:color w:val="000000" w:themeColor="text1"/>
+          <w:kern w:val="24"/>
+          <w:lang w:val="fr-FR"/>
+        </w:rPr>
+        <w:t xml:space="preserve"> </w:t>
+      </w:r>
+      <w:proofErr w:type="spellStart"/>
+      <w:r>
+        <w:rPr>
+          <w:rFonts w:hAnsi="Calibri"/>
+          <w:color w:val="000000" w:themeColor="text1"/>
+          <w:kern w:val="24"/>
+          <w:lang w:val="fr-FR"/>
+        </w:rPr>
+        <w:t>por</w:t>
+      </w:r>
+      <w:proofErr w:type="spellEnd"/>
+      <w:r>
+        <w:rPr>
+          <w:rFonts w:hAnsi="Calibri"/>
+          <w:color w:val="000000" w:themeColor="text1"/>
+          <w:kern w:val="24"/>
+          <w:lang w:val="fr-FR"/>
+        </w:rPr>
+        <w:t xml:space="preserve"> el Consejo mexicano de </w:t>
+      </w:r>
+      <w:proofErr w:type="spellStart"/>
+      <w:r>
+        <w:rPr>
+          <w:rFonts w:hAnsi="Calibri"/>
+          <w:color w:val="000000" w:themeColor="text1"/>
+          <w:kern w:val="24"/>
+          <w:lang w:val="fr-FR"/>
+        </w:rPr>
+        <w:t>endocrinolog</w:t>
       </w:r>
       <w:r>
         <w:rPr>
@@ -431,7 +870,17 @@
           <w:kern w:val="24"/>
           <w:lang w:val="fr-FR"/>
         </w:rPr>
-        <w:t>a 2016</w:t>
+        <w:t>a</w:t>
+      </w:r>
+      <w:proofErr w:type="spellEnd"/>
+      <w:r>
+        <w:rPr>
+          <w:rFonts w:hAnsi="Calibri"/>
+          <w:color w:val="000000" w:themeColor="text1"/>
+          <w:kern w:val="24"/>
+          <w:lang w:val="fr-FR"/>
+        </w:rPr>
+        <w:t xml:space="preserve"> 2016</w:t>
       </w:r>
     </w:p>
     <w:p>
@@ -453,7 +902,128 @@
           <w:kern w:val="24"/>
           <w:lang w:val="fr-FR"/>
         </w:rPr>
-        <w:t>Alta especialidad en Diabetes y Metabolismo: Universidad Nacional Aut</w:t>
+        <w:t xml:space="preserve">Alta </w:t>
+      </w:r>
+      <w:proofErr w:type="spellStart"/>
+      <w:r>
+        <w:rPr>
+          <w:rFonts w:hAnsi="Calibri"/>
+          <w:color w:val="000000" w:themeColor="text1"/>
+          <w:kern w:val="24"/>
+          <w:lang w:val="fr-FR"/>
+        </w:rPr>
+        <w:t>especialidad</w:t>
+      </w:r>
+      <w:proofErr w:type="spellEnd"/>
+      <w:r>
+        <w:rPr>
+          <w:rFonts w:hAnsi="Calibri"/>
+          <w:color w:val="000000" w:themeColor="text1"/>
+          <w:kern w:val="24"/>
+          <w:lang w:val="fr-FR"/>
+        </w:rPr>
+        <w:t xml:space="preserve"> en </w:t>
+      </w:r>
+      <w:proofErr w:type="spellStart"/>
+      <w:r>
+        <w:rPr>
+          <w:rFonts w:hAnsi="Calibri"/>
+          <w:color w:val="000000" w:themeColor="text1"/>
+          <w:kern w:val="24"/>
+          <w:lang w:val="fr-FR"/>
+        </w:rPr>
+        <w:t>Diabetes</w:t>
+      </w:r>
+      <w:proofErr w:type="spellEnd"/>
+      <w:r>
+        <w:rPr>
+          <w:rFonts w:hAnsi="Calibri"/>
+          <w:color w:val="000000" w:themeColor="text1"/>
+          <w:kern w:val="24"/>
+          <w:lang w:val="fr-FR"/>
+        </w:rPr>
+        <w:t xml:space="preserve"> y </w:t>
+      </w:r>
+      <w:proofErr w:type="spellStart"/>
+      <w:proofErr w:type="gramStart"/>
+      <w:r>
+        <w:rPr>
+          <w:rFonts w:hAnsi="Calibri"/>
+          <w:color w:val="000000" w:themeColor="text1"/>
+          <w:kern w:val="24"/>
+          <w:lang w:val="fr-FR"/>
+        </w:rPr>
+        <w:t>Metabolismo</w:t>
+      </w:r>
+      <w:proofErr w:type="spellEnd"/>
+      <w:r>
+        <w:rPr>
+          <w:rFonts w:hAnsi="Calibri"/>
+          <w:color w:val="000000" w:themeColor="text1"/>
+          <w:kern w:val="24"/>
+          <w:lang w:val="fr-FR"/>
+        </w:rPr>
+        <w:t>:</w:t>
+      </w:r>
+      <w:proofErr w:type="gramEnd"/>
+      <w:r>
+        <w:rPr>
+          <w:rFonts w:hAnsi="Calibri"/>
+          <w:color w:val="000000" w:themeColor="text1"/>
+          <w:kern w:val="24"/>
+          <w:lang w:val="fr-FR"/>
+        </w:rPr>
+        <w:t xml:space="preserve"> </w:t>
+      </w:r>
+      <w:proofErr w:type="spellStart"/>
+      <w:r>
+        <w:rPr>
+          <w:rFonts w:hAnsi="Calibri"/>
+          <w:color w:val="000000" w:themeColor="text1"/>
+          <w:kern w:val="24"/>
+          <w:lang w:val="fr-FR"/>
+        </w:rPr>
+        <w:t>Universidad</w:t>
+      </w:r>
+      <w:proofErr w:type="spellEnd"/>
+      <w:r>
+        <w:rPr>
+          <w:rFonts w:hAnsi="Calibri"/>
+          <w:color w:val="000000" w:themeColor="text1"/>
+          <w:kern w:val="24"/>
+          <w:lang w:val="fr-FR"/>
+        </w:rPr>
+        <w:t xml:space="preserve"> </w:t>
+      </w:r>
+      <w:proofErr w:type="spellStart"/>
+      <w:r>
+        <w:rPr>
+          <w:rFonts w:hAnsi="Calibri"/>
+          <w:color w:val="000000" w:themeColor="text1"/>
+          <w:kern w:val="24"/>
+          <w:lang w:val="fr-FR"/>
+        </w:rPr>
+        <w:t>Nacional</w:t>
+      </w:r>
+      <w:proofErr w:type="spellEnd"/>
+      <w:r>
+        <w:rPr>
+          <w:rFonts w:hAnsi="Calibri"/>
+          <w:color w:val="000000" w:themeColor="text1"/>
+          <w:kern w:val="24"/>
+          <w:lang w:val="fr-FR"/>
+        </w:rPr>
+        <w:t xml:space="preserve"> </w:t>
+      </w:r>
+      <w:proofErr w:type="spellStart"/>
+      <w:r>
+        <w:rPr>
+          <w:rFonts w:hAnsi="Calibri"/>
+          <w:color w:val="000000" w:themeColor="text1"/>
+          <w:kern w:val="24"/>
+          <w:lang w:val="fr-FR"/>
+        </w:rPr>
+        <w:t>Aut</w:t>
       </w:r>
       <w:r>
         <w:rPr>
@@ -471,7 +1041,17 @@
           <w:kern w:val="24"/>
           <w:lang w:val="fr-FR"/>
         </w:rPr>
-        <w:t>noma de M</w:t>
+        <w:t>noma</w:t>
+      </w:r>
+      <w:proofErr w:type="spellEnd"/>
+      <w:r>
+        <w:rPr>
+          <w:rFonts w:hAnsi="Calibri"/>
+          <w:color w:val="000000" w:themeColor="text1"/>
+          <w:kern w:val="24"/>
+          <w:lang w:val="fr-FR"/>
+        </w:rPr>
+        <w:t xml:space="preserve"> de M</w:t>
       </w:r>
       <w:r>
         <w:rPr>
@@ -489,7 +1069,98 @@
           <w:kern w:val="24"/>
           <w:lang w:val="fr-FR"/>
         </w:rPr>
-        <w:t>xico con sede en  (Instituto Nacional de Ciensas M</w:t>
+        <w:t xml:space="preserve">xico con </w:t>
+      </w:r>
+      <w:proofErr w:type="spellStart"/>
+      <w:r>
+        <w:rPr>
+          <w:rFonts w:hAnsi="Calibri"/>
+          <w:color w:val="000000" w:themeColor="text1"/>
+          <w:kern w:val="24"/>
+          <w:lang w:val="fr-FR"/>
+        </w:rPr>
+        <w:t>sede</w:t>
+      </w:r>
+      <w:proofErr w:type="spellEnd"/>
+      <w:r>
+        <w:rPr>
+          <w:rFonts w:hAnsi="Calibri"/>
+          <w:color w:val="000000" w:themeColor="text1"/>
+          <w:kern w:val="24"/>
+          <w:lang w:val="fr-FR"/>
+        </w:rPr>
+        <w:t xml:space="preserve"> </w:t>
+      </w:r>
+      <w:proofErr w:type="gramStart"/>
+      <w:r>
+        <w:rPr>
+          <w:rFonts w:hAnsi="Calibri"/>
+          <w:color w:val="000000" w:themeColor="text1"/>
+          <w:kern w:val="24"/>
+          <w:lang w:val="fr-FR"/>
+        </w:rPr>
+        <w:t>en  (</w:t>
+      </w:r>
+      <w:proofErr w:type="gramEnd"/>
+      <w:r>
+        <w:rPr>
+          <w:rFonts w:hAnsi="Calibri"/>
+          <w:color w:val="000000" w:themeColor="text1"/>
+          <w:kern w:val="24"/>
+          <w:lang w:val="fr-FR"/>
+        </w:rPr>
+        <w:t xml:space="preserve">Instituto </w:t>
+      </w:r>
+      <w:proofErr w:type="spellStart"/>
+      <w:r>
+        <w:rPr>
+          <w:rFonts w:hAnsi="Calibri"/>
+          <w:color w:val="000000" w:themeColor="text1"/>
+          <w:kern w:val="24"/>
+          <w:lang w:val="fr-FR"/>
+        </w:rPr>
+        <w:t>Nacional</w:t>
+      </w:r>
+      <w:proofErr w:type="spellEnd"/>
+      <w:r>
+        <w:rPr>
+          <w:rFonts w:hAnsi="Calibri"/>
+          <w:color w:val="000000" w:themeColor="text1"/>
+          <w:kern w:val="24"/>
+          <w:lang w:val="fr-FR"/>
+        </w:rPr>
+        <w:t xml:space="preserve"> de </w:t>
+      </w:r>
+      <w:proofErr w:type="spellStart"/>
+      <w:r>
+        <w:rPr>
+          <w:rFonts w:hAnsi="Calibri"/>
+          <w:color w:val="000000" w:themeColor="text1"/>
+          <w:kern w:val="24"/>
+          <w:lang w:val="fr-FR"/>
+        </w:rPr>
+        <w:t>Ciensas</w:t>
+      </w:r>
+      <w:proofErr w:type="spellEnd"/>
+      <w:r>
+        <w:rPr>
+          <w:rFonts w:hAnsi="Calibri"/>
+          <w:color w:val="000000" w:themeColor="text1"/>
+          <w:kern w:val="24"/>
+          <w:lang w:val="fr-FR"/>
+        </w:rPr>
+        <w:t xml:space="preserve"> </w:t>
+      </w:r>
+      <w:proofErr w:type="spellStart"/>
+      <w:proofErr w:type="gramStart"/>
+      <w:r>
+        <w:rPr>
+          <w:rFonts w:hAnsi="Calibri"/>
+          <w:color w:val="000000" w:themeColor="text1"/>
+          <w:kern w:val="24"/>
+          <w:lang w:val="fr-FR"/>
+        </w:rPr>
+        <w:t>M</w:t>
       </w:r>
       <w:r>
         <w:rPr>
@@ -507,7 +1178,37 @@
           <w:kern w:val="24"/>
           <w:lang w:val="fr-FR"/>
         </w:rPr>
-        <w:t>dicas  y de la Nutrici</w:t>
+        <w:t>dicas</w:t>
+      </w:r>
+      <w:proofErr w:type="spellEnd"/>
+      <w:r>
+        <w:rPr>
+          <w:rFonts w:hAnsi="Calibri"/>
+          <w:color w:val="000000" w:themeColor="text1"/>
+          <w:kern w:val="24"/>
+          <w:lang w:val="fr-FR"/>
+        </w:rPr>
+        <w:t xml:space="preserve">  y</w:t>
+      </w:r>
+      <w:proofErr w:type="gramEnd"/>
+      <w:r>
+        <w:rPr>
+          <w:rFonts w:hAnsi="Calibri"/>
+          <w:color w:val="000000" w:themeColor="text1"/>
+          <w:kern w:val="24"/>
+          <w:lang w:val="fr-FR"/>
+        </w:rPr>
+        <w:t xml:space="preserve"> de la </w:t>
+      </w:r>
+      <w:proofErr w:type="spellStart"/>
+      <w:r>
+        <w:rPr>
+          <w:rFonts w:hAnsi="Calibri"/>
+          <w:color w:val="000000" w:themeColor="text1"/>
+          <w:kern w:val="24"/>
+          <w:lang w:val="fr-FR"/>
+        </w:rPr>
+        <w:t>Nutrici</w:t>
       </w:r>
       <w:r>
         <w:rPr>
@@ -525,7 +1226,37 @@
           <w:kern w:val="24"/>
           <w:lang w:val="fr-FR"/>
         </w:rPr>
-        <w:t>n Salvardor Zubir</w:t>
+        <w:t>n</w:t>
+      </w:r>
+      <w:proofErr w:type="spellEnd"/>
+      <w:r>
+        <w:rPr>
+          <w:rFonts w:hAnsi="Calibri"/>
+          <w:color w:val="000000" w:themeColor="text1"/>
+          <w:kern w:val="24"/>
+          <w:lang w:val="fr-FR"/>
+        </w:rPr>
+        <w:t xml:space="preserve"> </w:t>
+      </w:r>
+      <w:proofErr w:type="spellStart"/>
+      <w:r>
+        <w:rPr>
+          <w:rFonts w:hAnsi="Calibri"/>
+          <w:color w:val="000000" w:themeColor="text1"/>
+          <w:kern w:val="24"/>
+          <w:lang w:val="fr-FR"/>
+        </w:rPr>
+        <w:t>Salvardor</w:t>
+      </w:r>
+      <w:proofErr w:type="spellEnd"/>
+      <w:r>
+        <w:rPr>
+          <w:rFonts w:hAnsi="Calibri"/>
+          <w:color w:val="000000" w:themeColor="text1"/>
+          <w:kern w:val="24"/>
+          <w:lang w:val="fr-FR"/>
+        </w:rPr>
+        <w:t xml:space="preserve"> Zubir</w:t>
       </w:r>
       <w:r>
         <w:rPr>
@@ -968,7 +1699,47 @@
           <w:kern w:val="24"/>
           <w:lang w:val="es-ES"/>
         </w:rPr>
-        <w:t xml:space="preserve"> en  Diabetes Tipo 1  online para m</w:t>
+        <w:t xml:space="preserve"> </w:t>
+      </w:r>
+      <w:proofErr w:type="gramStart"/>
+      <w:r>
+        <w:rPr>
+          <w:rFonts w:hAnsi="Calibri"/>
+          <w:color w:val="000000" w:themeColor="text1"/>
+          <w:kern w:val="24"/>
+          <w:lang w:val="es-ES"/>
+        </w:rPr>
+        <w:t>en  Diabetes</w:t>
+      </w:r>
+      <w:proofErr w:type="gramEnd"/>
+      <w:r>
+        <w:rPr>
+          <w:rFonts w:hAnsi="Calibri"/>
+          <w:color w:val="000000" w:themeColor="text1"/>
+          <w:kern w:val="24"/>
+          <w:lang w:val="es-ES"/>
+        </w:rPr>
+        <w:t xml:space="preserve"> Tipo </w:t>
+      </w:r>
+      <w:proofErr w:type="gramStart"/>
+      <w:r>
+        <w:rPr>
+          <w:rFonts w:hAnsi="Calibri"/>
+          <w:color w:val="000000" w:themeColor="text1"/>
+          <w:kern w:val="24"/>
+          <w:lang w:val="es-ES"/>
+        </w:rPr>
+        <w:t>1  online</w:t>
+      </w:r>
+      <w:proofErr w:type="gramEnd"/>
+      <w:r>
+        <w:rPr>
+          <w:rFonts w:hAnsi="Calibri"/>
+          <w:color w:val="000000" w:themeColor="text1"/>
+          <w:kern w:val="24"/>
+          <w:lang w:val="es-ES"/>
+        </w:rPr>
+        <w:t xml:space="preserve"> para m</w:t>
       </w:r>
       <w:r>
         <w:rPr>
@@ -1147,6 +1918,25 @@
     </w:p>
     <w:p>
       <w:pPr>
+        <w:pStyle w:val="Prrafodelista"/>
+        <w:numPr>
+          <w:ilvl w:val="0"/>
+          <w:numId w:val="2"/>
+        </w:numPr>
+        <w:jc w:val="both"/>
+        <w:rPr>
+          <w:rFonts w:eastAsia="Times New Roman"/>
+        </w:rPr>
+      </w:pPr>
+      <w:r>
+        <w:rPr>
+          <w:rFonts w:eastAsia="Times New Roman"/>
+        </w:rPr>
+        <w:t>Creadora del Podcast En Rango: Educación digital para personas que viven con diabetes tipo 1.</w:t>
+      </w:r>
+    </w:p>
+    <w:p>
+      <w:pPr>
         <w:pStyle w:val="NormalWeb"/>
         <w:spacing w:before="0" w:beforeAutospacing="0" w:after="0" w:afterAutospacing="0"/>
         <w:rPr>
@@ -1222,7 +2012,7 @@
           <w:lang w:val="en-US" w:eastAsia="es-ES"/>
           <w14:ligatures w14:val="none"/>
         </w:rPr>
-        <w:t>The Valdivia Project: genetic characterization of a unique Wolfram Syndrome cluster in coastal Ecuador.  Josefa E. Palacio</w:t>
+        <w:t xml:space="preserve">The Valdivia Project: genetic characterization of a unique Wolfram Syndrome cluster in coastal Ecuador.  </w:t>
       </w:r>
       <w:r>
         <w:rPr>
@@ -1231,35 +2021,35 @@
           <w:bCs/>
           <w:color w:val="000000" w:themeColor="text1"/>
           <w:kern w:val="24"/>
-          <w:lang w:val="en-US" w:eastAsia="es-ES"/>
-          <w14:ligatures w14:val="none"/>
-        </w:rPr>
-        <w:t>1</w:t>
-      </w:r>
-      <w:proofErr w:type="gramStart"/>
-      <w:r>
-        <w:rPr>
-          <w:rFonts w:asciiTheme="minorHAnsi" w:eastAsiaTheme="minorEastAsia" w:hAnsi="Calibri" w:cstheme="minorBidi"/>
-          <w:color w:val="000000" w:themeColor="text1"/>
-          <w:kern w:val="24"/>
-          <w:lang w:val="en-US" w:eastAsia="es-ES"/>
-          <w14:ligatures w14:val="none"/>
-        </w:rPr>
-        <w:t xml:space="preserve">* </w:t>
-      </w:r>
-      <w:r>
-        <w:rPr>
-          <w:rFonts w:asciiTheme="minorHAnsi" w:eastAsiaTheme="minorEastAsia" w:hAnsi="Calibri" w:cstheme="minorBidi"/>
-          <w:color w:val="000000" w:themeColor="text1"/>
-          <w:kern w:val="24"/>
           <w:sz w:val="20"/>
           <w:szCs w:val="20"/>
-          <w:lang w:val="en-US" w:eastAsia="es-ES"/>
+          <w:lang w:val="es-EC" w:eastAsia="es-ES"/>
           <w14:ligatures w14:val="none"/>
         </w:rPr>
-        <w:t>,</w:t>
-      </w:r>
-      <w:proofErr w:type="gramEnd"/>
+        <w:t>Josefa E. Palacio</w:t>
+      </w:r>
+      <w:r>
+        <w:rPr>
+          <w:rFonts w:asciiTheme="minorHAnsi" w:eastAsiaTheme="minorEastAsia" w:hAnsi="Calibri" w:cstheme="minorBidi"/>
+          <w:b/>
+          <w:bCs/>
+          <w:color w:val="000000" w:themeColor="text1"/>
+          <w:kern w:val="24"/>
+          <w:lang w:val="es-EC" w:eastAsia="es-ES"/>
+          <w14:ligatures w14:val="none"/>
+        </w:rPr>
+        <w:t>1</w:t>
+      </w:r>
+      <w:r>
+        <w:rPr>
+          <w:rFonts w:asciiTheme="minorHAnsi" w:eastAsiaTheme="minorEastAsia" w:hAnsi="Calibri" w:cstheme="minorBidi"/>
+          <w:color w:val="000000" w:themeColor="text1"/>
+          <w:kern w:val="24"/>
+          <w:lang w:val="es-EC" w:eastAsia="es-ES"/>
+          <w14:ligatures w14:val="none"/>
+        </w:rPr>
+        <w:t xml:space="preserve">* </w:t>
+      </w:r>
       <w:r>
         <w:rPr>
           <w:rFonts w:asciiTheme="minorHAnsi" w:eastAsiaTheme="minorEastAsia" w:hAnsi="Calibri" w:cstheme="minorBidi"/>
@@ -1267,10 +2057,10 @@
           <w:kern w:val="24"/>
           <w:sz w:val="20"/>
           <w:szCs w:val="20"/>
-          <w:lang w:val="en-US" w:eastAsia="es-ES"/>
+          <w:lang w:val="es-EC" w:eastAsia="es-ES"/>
           <w14:ligatures w14:val="none"/>
         </w:rPr>
-        <w:t xml:space="preserve"> Mar</w:t>
+        <w:t>, Mar</w:t>
       </w:r>
       <w:r>
         <w:rPr>
@@ -1279,7 +2069,7 @@
           <w:kern w:val="24"/>
           <w:sz w:val="20"/>
           <w:szCs w:val="20"/>
-          <w:lang w:val="en-US" w:eastAsia="es-ES"/>
+          <w:lang w:val="es-EC" w:eastAsia="es-ES"/>
           <w14:ligatures w14:val="none"/>
         </w:rPr>
         <w:t>í</w:t>
@@ -1291,7 +2081,7 @@
           <w:kern w:val="24"/>
           <w:sz w:val="20"/>
           <w:szCs w:val="20"/>
-          <w:lang w:val="en-US" w:eastAsia="es-ES"/>
+          <w:lang w:val="es-EC" w:eastAsia="es-ES"/>
           <w14:ligatures w14:val="none"/>
         </w:rPr>
         <w:t>a S. Verdesoto</w:t>
@@ -1301,7 +2091,7 @@
           <w:rFonts w:asciiTheme="minorHAnsi" w:eastAsiaTheme="minorEastAsia" w:hAnsi="Calibri" w:cstheme="minorBidi"/>
           <w:color w:val="000000" w:themeColor="text1"/>
           <w:kern w:val="24"/>
-          <w:lang w:val="en-US" w:eastAsia="es-ES"/>
+          <w:lang w:val="es-EC" w:eastAsia="es-ES"/>
           <w14:ligatures w14:val="none"/>
         </w:rPr>
         <w:t>1</w:t>
@@ -1313,7 +2103,7 @@
           <w:kern w:val="24"/>
           <w:sz w:val="20"/>
           <w:szCs w:val="20"/>
-          <w:lang w:val="en-US" w:eastAsia="es-ES"/>
+          <w:lang w:val="es-EC" w:eastAsia="es-ES"/>
           <w14:ligatures w14:val="none"/>
         </w:rPr>
         <w:t>, Noem</w:t>
@@ -1325,7 +2115,7 @@
           <w:kern w:val="24"/>
           <w:sz w:val="20"/>
           <w:szCs w:val="20"/>
-          <w:lang w:val="en-US" w:eastAsia="es-ES"/>
+          <w:lang w:val="es-EC" w:eastAsia="es-ES"/>
           <w14:ligatures w14:val="none"/>
         </w:rPr>
         <w:t>í</w:t>
@@ -1337,7 +2127,7 @@
           <w:kern w:val="24"/>
           <w:sz w:val="20"/>
           <w:szCs w:val="20"/>
-          <w:lang w:val="en-US" w:eastAsia="es-ES"/>
+          <w:lang w:val="es-EC" w:eastAsia="es-ES"/>
           <w14:ligatures w14:val="none"/>
         </w:rPr>
         <w:t xml:space="preserve"> L. Bautista</w:t>
@@ -1347,7 +2137,7 @@
           <w:rFonts w:asciiTheme="minorHAnsi" w:eastAsiaTheme="minorEastAsia" w:hAnsi="Calibri" w:cstheme="minorBidi"/>
           <w:color w:val="000000" w:themeColor="text1"/>
           <w:kern w:val="24"/>
-          <w:lang w:val="en-US" w:eastAsia="es-ES"/>
+          <w:lang w:val="es-EC" w:eastAsia="es-ES"/>
           <w14:ligatures w14:val="none"/>
         </w:rPr>
         <w:t>1</w:t>
@@ -1359,7 +2149,7 @@
           <w:kern w:val="24"/>
           <w:sz w:val="20"/>
           <w:szCs w:val="20"/>
-          <w:lang w:val="en-US" w:eastAsia="es-ES"/>
+          <w:lang w:val="es-EC" w:eastAsia="es-ES"/>
           <w14:ligatures w14:val="none"/>
         </w:rPr>
         <w:t>, Abigail J. Segura</w:t>
@@ -1369,7 +2159,7 @@
           <w:rFonts w:asciiTheme="minorHAnsi" w:eastAsiaTheme="minorEastAsia" w:hAnsi="Calibri" w:cstheme="minorBidi"/>
           <w:color w:val="000000" w:themeColor="text1"/>
           <w:kern w:val="24"/>
-          <w:lang w:val="en-US" w:eastAsia="es-ES"/>
+          <w:lang w:val="es-EC" w:eastAsia="es-ES"/>
           <w14:ligatures w14:val="none"/>
         </w:rPr>
         <w:t>1</w:t>
@@ -1381,7 +2171,7 @@
           <w:kern w:val="24"/>
           <w:sz w:val="20"/>
           <w:szCs w:val="20"/>
-          <w:lang w:val="en-US" w:eastAsia="es-ES"/>
+          <w:lang w:val="es-EC" w:eastAsia="es-ES"/>
           <w14:ligatures w14:val="none"/>
         </w:rPr>
         <w:t>, Roberto C. Cede</w:t>
@@ -1393,7 +2183,7 @@
           <w:kern w:val="24"/>
           <w:sz w:val="20"/>
           <w:szCs w:val="20"/>
-          <w:lang w:val="en-US" w:eastAsia="es-ES"/>
+          <w:lang w:val="es-EC" w:eastAsia="es-ES"/>
           <w14:ligatures w14:val="none"/>
         </w:rPr>
         <w:t>ñ</w:t>
@@ -1405,7 +2195,7 @@
           <w:kern w:val="24"/>
           <w:sz w:val="20"/>
           <w:szCs w:val="20"/>
-          <w:lang w:val="en-US" w:eastAsia="es-ES"/>
+          <w:lang w:val="es-EC" w:eastAsia="es-ES"/>
           <w14:ligatures w14:val="none"/>
         </w:rPr>
         <w:t>o</w:t>
@@ -1415,7 +2205,7 @@
           <w:rFonts w:asciiTheme="minorHAnsi" w:eastAsiaTheme="minorEastAsia" w:hAnsi="Calibri" w:cstheme="minorBidi"/>
           <w:color w:val="000000" w:themeColor="text1"/>
           <w:kern w:val="24"/>
-          <w:lang w:val="en-US" w:eastAsia="es-ES"/>
+          <w:lang w:val="es-EC" w:eastAsia="es-ES"/>
           <w14:ligatures w14:val="none"/>
         </w:rPr>
         <w:t>1</w:t>
@@ -1427,7 +2217,7 @@
           <w:kern w:val="24"/>
           <w:sz w:val="20"/>
           <w:szCs w:val="20"/>
-          <w:lang w:val="en-US" w:eastAsia="es-ES"/>
+          <w:lang w:val="es-EC" w:eastAsia="es-ES"/>
           <w14:ligatures w14:val="none"/>
         </w:rPr>
         <w:t>, Nancy J. Flores</w:t>
@@ -1437,7 +2227,7 @@
           <w:rFonts w:asciiTheme="minorHAnsi" w:eastAsiaTheme="minorEastAsia" w:hAnsi="Calibri" w:cstheme="minorBidi"/>
           <w:color w:val="000000" w:themeColor="text1"/>
           <w:kern w:val="24"/>
-          <w:lang w:val="en-US" w:eastAsia="es-ES"/>
+          <w:lang w:val="es-EC" w:eastAsia="es-ES"/>
           <w14:ligatures w14:val="none"/>
         </w:rPr>
         <w:t xml:space="preserve">1 </w:t>
@@ -1449,7 +2239,7 @@
           <w:kern w:val="24"/>
           <w:sz w:val="20"/>
           <w:szCs w:val="20"/>
-          <w:lang w:val="en-US" w:eastAsia="es-ES"/>
+          <w:lang w:val="es-EC" w:eastAsia="es-ES"/>
           <w14:ligatures w14:val="none"/>
         </w:rPr>
         <w:t>and Juan C. Zevallos</w:t>
@@ -1459,7 +2249,7 @@
           <w:rFonts w:asciiTheme="minorHAnsi" w:eastAsiaTheme="minorEastAsia" w:hAnsi="Calibri" w:cstheme="minorBidi"/>
           <w:color w:val="000000" w:themeColor="text1"/>
           <w:kern w:val="24"/>
-          <w:lang w:val="en-US" w:eastAsia="es-ES"/>
+          <w:lang w:val="es-EC" w:eastAsia="es-ES"/>
           <w14:ligatures w14:val="none"/>
         </w:rPr>
         <w:t xml:space="preserve">1*.  </w:t>
@@ -1575,7 +2365,27 @@
           <w:kern w:val="24"/>
           <w:lang w:val="es-ES"/>
         </w:rPr>
-        <w:t xml:space="preserve"> of </w:t>
+        <w:t xml:space="preserve"> </w:t>
+      </w:r>
+      <w:proofErr w:type="spellStart"/>
+      <w:r>
+        <w:rPr>
+          <w:rFonts w:hAnsi="Calibri"/>
+          <w:color w:val="000000" w:themeColor="text1"/>
+          <w:kern w:val="24"/>
+          <w:lang w:val="es-ES"/>
+        </w:rPr>
+        <w:t>of</w:t>
+      </w:r>
+      <w:proofErr w:type="spellEnd"/>
+      <w:r>
+        <w:rPr>
+          <w:rFonts w:hAnsi="Calibri"/>
+          <w:color w:val="000000" w:themeColor="text1"/>
+          <w:kern w:val="24"/>
+          <w:lang w:val="es-ES"/>
+        </w:rPr>
+        <w:t xml:space="preserve"> </w:t>
       </w:r>
       <w:proofErr w:type="spellStart"/>
       <w:r>
@@ -1776,7 +2586,27 @@
           <w:kern w:val="24"/>
           <w:lang w:val="en-US"/>
         </w:rPr>
-        <w:t xml:space="preserve">Thyroid Cancer Mortality in Ecuador.  Endocrine Society. March 18, 2018 presentation. Endocrine Reviews, Volume 39, Issue </w:t>
+        <w:t xml:space="preserve">Thyroid Cancer Mortality in Ecuador.  Endocrine Society. March 18, </w:t>
+      </w:r>
+      <w:proofErr w:type="gramStart"/>
+      <w:r>
+        <w:rPr>
+          <w:rFonts w:hAnsi="Calibri"/>
+          <w:color w:val="000000" w:themeColor="text1"/>
+          <w:kern w:val="24"/>
+          <w:lang w:val="en-US"/>
+        </w:rPr>
+        <w:t>2018</w:t>
+      </w:r>
+      <w:proofErr w:type="gramEnd"/>
+      <w:r>
+        <w:rPr>
+          <w:rFonts w:hAnsi="Calibri"/>
+          <w:color w:val="000000" w:themeColor="text1"/>
+          <w:kern w:val="24"/>
+          <w:lang w:val="en-US"/>
+        </w:rPr>
+        <w:t xml:space="preserve"> presentation. Endocrine Reviews, Volume 39, Issue </w:t>
       </w:r>
       <w:proofErr w:type="gramStart"/>
       <w:r>
@@ -1837,7 +2667,7 @@
           <w:rFonts w:hAnsi="Calibri"/>
           <w:color w:val="000000" w:themeColor="text1"/>
           <w:kern w:val="24"/>
-          <w:lang w:val="es-EC"/>
+          <w:lang w:val="en-US"/>
         </w:rPr>
       </w:pPr>
     </w:p>
@@ -1848,7 +2678,7 @@
           <w:rFonts w:hAnsi="Calibri"/>
           <w:color w:val="000000" w:themeColor="text1"/>
           <w:kern w:val="24"/>
-          <w:lang w:val="es-EC"/>
+          <w:lang w:val="en-US"/>
         </w:rPr>
       </w:pPr>
     </w:p>
@@ -1859,7 +2689,7 @@
           <w:rFonts w:hAnsi="Calibri"/>
           <w:color w:val="000000" w:themeColor="text1"/>
           <w:kern w:val="24"/>
-          <w:lang w:val="es-EC"/>
+          <w:lang w:val="en-US"/>
         </w:rPr>
       </w:pPr>
     </w:p>
@@ -1874,7 +2704,7 @@
 </file>
 
 <file path=word/numbering.xml><?xml version="1.0" encoding="utf-8"?>
-<w:numbering xmlns:wpc="http://schemas.microsoft.com/office/word/2010/wordprocessingCanvas" xmlns:cx="http://schemas.microsoft.com/office/drawing/2014/chartex" xmlns:mc="http://schemas.openxmlformats.org/markup-compatibility/2006" xmlns:o="urn:schemas-microsoft-com:office:office" xmlns:r="http://schemas.openxmlformats.org/officeDocument/2006/relationships" xmlns:m="http://schemas.openxmlformats.org/officeDocument/2006/math" xmlns:v="urn:schemas-microsoft-com:vml" xmlns:wp14="http://schemas.microsoft.com/office/word/2010/wordprocessingDrawing" xmlns:wp="http://schemas.openxmlformats.org/drawingml/2006/wordprocessingDrawing" xmlns:w10="urn:schemas-microsoft-com:office:word" xmlns:w="http://schemas.openxmlformats.org/wordprocessingml/2006/main" xmlns:w14="http://schemas.microsoft.com/office/word/2010/wordml" xmlns:w15="http://schemas.microsoft.com/office/word/2012/wordml" xmlns:w16se="http://schemas.microsoft.com/office/word/2015/wordml/symex" xmlns:wpg="http://schemas.microsoft.com/office/word/2010/wordprocessingGroup" xmlns:wpi="http://schemas.microsoft.com/office/word/2010/wordprocessingInk" xmlns:wne="http://schemas.microsoft.com/office/word/2006/wordml" xmlns:wps="http://schemas.microsoft.com/office/word/2010/wordprocessingShape" mc:Ignorable="w14 w15 w16se wp14">
+<w:numbering xmlns:wpc="http://schemas.microsoft.com/office/word/2010/wordprocessingCanvas" xmlns:cx="http://schemas.microsoft.com/office/drawing/2014/chartex" xmlns:cx1="http://schemas.microsoft.com/office/drawing/2015/9/8/chartex" xmlns:cx2="http://schemas.microsoft.com/office/drawing/2015/10/21/chartex" xmlns:cx3="http://schemas.microsoft.com/office/drawing/2016/5/9/chartex" xmlns:cx4="http://schemas.microsoft.com/office/drawing/2016/5/10/chartex" xmlns:cx5="http://schemas.microsoft.com/office/drawing/2016/5/11/chartex" xmlns:cx6="http://schemas.microsoft.com/office/drawing/2016/5/12/chartex" xmlns:cx7="http://schemas.microsoft.com/office/drawing/2016/5/13/chartex" xmlns:cx8="http://schemas.microsoft.com/office/drawing/2016/5/14/chartex" xmlns:mc="http://schemas.openxmlformats.org/markup-compatibility/2006" xmlns:m="http://schemas.openxmlformats.org/officeDocument/2006/math" xmlns:aink="http://schemas.microsoft.com/office/drawing/2016/ink" xmlns:am3d="http://schemas.microsoft.com/office/drawing/2017/model3d" xmlns:oel="http://schemas.microsoft.com/office/2019/extlst" xmlns:r="http://schemas.openxmlformats.org/officeDocument/2006/relationships" xmlns:wp14="http://schemas.microsoft.com/office/word/2010/wordprocessingDrawing" xmlns:wp="http://schemas.openxmlformats.org/drawingml/2006/wordprocessingDrawing" xmlns:wpg="http://schemas.microsoft.com/office/word/2010/wordprocessingGroup" xmlns:wpi="http://schemas.microsoft.com/office/word/2010/wordprocessingInk" xmlns:wps="http://schemas.microsoft.com/office/word/2010/wordprocessingShape" xmlns:o="urn:schemas-microsoft-com:office:office" xmlns:v="urn:schemas-microsoft-com:vml" xmlns:w10="urn:schemas-microsoft-com:office:word" xmlns:w="http://schemas.openxmlformats.org/wordprocessingml/2006/main" xmlns:w14="http://schemas.microsoft.com/office/word/2010/wordml" xmlns:w15="http://schemas.microsoft.com/office/word/2012/wordml" xmlns:w16cex="http://schemas.microsoft.com/office/word/2018/wordml/cex" xmlns:w16cid="http://schemas.microsoft.com/office/word/2016/wordml/cid" xmlns:w16="http://schemas.microsoft.com/office/word/2018/wordml" xmlns:w16sdtdh="http://schemas.microsoft.com/office/word/2020/wordml/sdtdatahash" xmlns:w16sdtfl="http://schemas.microsoft.com/office/word/2024/wordml/sdtformatlock" xmlns:w16se="http://schemas.microsoft.com/office/word/2015/wordml/symex" xmlns:w16du="http://schemas.microsoft.com/office/word/2023/wordml/word16du" xmlns:wne="http://schemas.microsoft.com/office/word/2006/wordml" mc:Ignorable="w14 w15 w16se w16cid w16 w16cex w16sdtdh w16sdtfl w16du wp14">
   <w:abstractNum w:abstractNumId="0" w15:restartNumberingAfterBreak="0">
     <w:nsid w:val="0C345571"/>
     <w:multiLevelType w:val="multilevel"/>
@@ -2444,23 +3274,23 @@
       </w:rPr>
     </w:lvl>
   </w:abstractNum>
-  <w:num w:numId="1">
+  <w:num w:numId="1" w16cid:durableId="324865904">
     <w:abstractNumId w:val="3"/>
   </w:num>
-  <w:num w:numId="2">
+  <w:num w:numId="2" w16cid:durableId="1371150345">
     <w:abstractNumId w:val="1"/>
   </w:num>
-  <w:num w:numId="3">
+  <w:num w:numId="3" w16cid:durableId="1682466271">
     <w:abstractNumId w:val="2"/>
   </w:num>
-  <w:num w:numId="4">
+  <w:num w:numId="4" w16cid:durableId="879439966">
     <w:abstractNumId w:val="0"/>
   </w:num>
 </w:numbering>
 </file>
 
 <file path=word/styles.xml><?xml version="1.0" encoding="utf-8"?>
-<w:styles xmlns:mc="http://schemas.openxmlformats.org/markup-compatibility/2006" xmlns:r="http://schemas.openxmlformats.org/officeDocument/2006/relationships" xmlns:w="http://schemas.openxmlformats.org/wordprocessingml/2006/main" xmlns:w14="http://schemas.microsoft.com/office/word/2010/wordml" xmlns:w15="http://schemas.microsoft.com/office/word/2012/wordml" xmlns:w16se="http://schemas.microsoft.com/office/word/2015/wordml/symex" mc:Ignorable="w14 w15 w16se">
+<w:styles xmlns:mc="http://schemas.openxmlformats.org/markup-compatibility/2006" xmlns:r="http://schemas.openxmlformats.org/officeDocument/2006/relationships" xmlns:w="http://schemas.openxmlformats.org/wordprocessingml/2006/main" xmlns:w14="http://schemas.microsoft.com/office/word/2010/wordml" xmlns:w15="http://schemas.microsoft.com/office/word/2012/wordml" xmlns:w16cex="http://schemas.microsoft.com/office/word/2018/wordml/cex" xmlns:w16cid="http://schemas.microsoft.com/office/word/2016/wordml/cid" xmlns:w16="http://schemas.microsoft.com/office/word/2018/wordml" xmlns:w16sdtdh="http://schemas.microsoft.com/office/word/2020/wordml/sdtdatahash" xmlns:w16sdtfl="http://schemas.microsoft.com/office/word/2024/wordml/sdtformatlock" xmlns:w16se="http://schemas.microsoft.com/office/word/2015/wordml/symex" xmlns:w16du="http://schemas.microsoft.com/office/word/2023/wordml/word16du" mc:Ignorable="w14 w15 w16se w16cid w16 w16cex w16sdtdh w16sdtfl w16du">
   <w:docDefaults>
     <w:rPrDefault>
       <w:rPr>
@@ -2474,7 +3304,7 @@
     </w:rPrDefault>
     <w:pPrDefault/>
   </w:docDefaults>
-  <w:latentStyles w:defLockedState="0" w:defUIPriority="99" w:defSemiHidden="0" w:defUnhideWhenUsed="0" w:defQFormat="0" w:count="371">
+  <w:latentStyles w:defLockedState="0" w:defUIPriority="99" w:defSemiHidden="0" w:defUnhideWhenUsed="0" w:defQFormat="0" w:count="376">
     <w:lsdException w:name="Normal" w:uiPriority="0" w:qFormat="1"/>
     <w:lsdException w:name="heading 1" w:uiPriority="9" w:qFormat="1"/>
     <w:lsdException w:name="heading 2" w:semiHidden="1" w:uiPriority="9" w:unhideWhenUsed="1" w:qFormat="1"/>
@@ -2846,6 +3676,11 @@
     <w:lsdException w:name="List Table 5 Dark Accent 6" w:uiPriority="50"/>
     <w:lsdException w:name="List Table 6 Colorful Accent 6" w:uiPriority="51"/>
     <w:lsdException w:name="List Table 7 Colorful Accent 6" w:uiPriority="52"/>
+    <w:lsdException w:name="Mention" w:semiHidden="1" w:unhideWhenUsed="1"/>
+    <w:lsdException w:name="Smart Hyperlink" w:semiHidden="1" w:unhideWhenUsed="1"/>
+    <w:lsdException w:name="Hashtag" w:semiHidden="1" w:unhideWhenUsed="1"/>
+    <w:lsdException w:name="Unresolved Mention" w:semiHidden="1" w:unhideWhenUsed="1"/>
+    <w:lsdException w:name="Smart Link" w:semiHidden="1" w:unhideWhenUsed="1"/>
   </w:latentStyles>
   <w:style w:type="paragraph" w:default="1" w:styleId="Normal">
     <w:name w:val="Normal"/>

</xml_diff>